<commit_message>
drukte: dagoverzicht (mig 0079) per datum en uur + dagcontext, dagelijkse rollup, prune pas na maand- en dagoverzicht; doc bijgewerkt
Co-Authored-By: Claude Sonnet 5.5 <noreply@anthropic.com>
</commit_message>
<xml_diff>
--- a/docs/werking/rustige-momenten-model-v2.docx
+++ b/docs/werking/rustige-momenten-model-v2.docx
@@ -5992,10 +5992,10 @@
           <w:b/>
           <w:bCs/>
         </w:rPr>
-        <w:t xml:space="preserve">Het label "ongewoon rustig" is te ruim. </w:t>
-      </w:r>
-      <w:r>
-        <w:t xml:space="preserve">Het staat bij 46% van de voorstellen, ook bij 2× de schommeling (bij 3× nog 35%, bij 4× 29%). Een label dat bij bijna de helft staat zegt weinig. Voorstel om te bespreken: het label reserveren voor de duidelijk ongewone gevallen.</w:t>
+        <w:t xml:space="preserve">Het label "ongewoon rustig" was te ruim. </w:t>
+      </w:r>
+      <w:r>
+        <w:t xml:space="preserve">Opgelost, zie hoofdstuk 11.</w:t>
       </w:r>
     </w:p>
     <w:p>
@@ -6773,6 +6773,174 @@
       </w:pPr>
       <w:r>
         <w:t xml:space="preserve">De drukte komt uit Google "Populaire tijden", opgehaald via Apify. Google beperkt in zijn voorwaarden het langdurig bewaren van bepaalde gegevens. Wij bewaren alleen afgeleide, samengevatte drukte (mediaan per uur), maar dit is iets om vooraf met de jurist na te lopen voordat we er een blijvend bestand van maken. Dit hoort bij dezelfde controle als het punt "geen Meta-platformdata naar Claude": waar staan de grenzen voor het bewaren en gebruiken van data van derden.</w:t>
+      </w:r>
+    </w:p>
+    <w:p>
+      <w:pPr>
+        <w:pStyle w:val="Heading1"/>
+        <w:spacing w:after="140" w:before="320"/>
+      </w:pPr>
+      <w:r>
+        <w:t xml:space="preserve">11. Aanpassingen na de eerste doorrekening</w:t>
+      </w:r>
+    </w:p>
+    <w:p>
+      <w:pPr>
+        <w:pStyle w:val="Heading2"/>
+        <w:spacing w:after="100" w:before="220"/>
+      </w:pPr>
+      <w:r>
+        <w:t xml:space="preserve">Het label "ongewoon rustig" is strakker</w:t>
+      </w:r>
+    </w:p>
+    <w:p>
+      <w:pPr>
+        <w:spacing w:after="120" w:line="300"/>
+      </w:pPr>
+      <w:r>
+        <w:t xml:space="preserve">Bij de eerste versie stond het label bij 46% van de voorstellen. De oorzaak zat in het model: het rekende in punten, en ging ervan uit dat elke dag evenveel schommelt. Een drukke weekenddag heeft in punten grotere dalen en leek daardoor steeds "ongewoon" rustig. Dat gaf dat label ook een extra zetje in de score, en liet het weekend te vaak winnen.</w:t>
+      </w:r>
+    </w:p>
+    <w:p>
+      <w:pPr>
+        <w:spacing w:after="120" w:line="300"/>
+      </w:pPr>
+      <w:r>
+        <w:t xml:space="preserve">Het model rekent nu in verhoudingen (op de logaritme van de drukte). Een moment heet "ongewoon rustig" als het minstens 12% onder het verwachte niveau ligt voor die weekdag en dat dagdeel. Resultaat in de 300 scenario's: het label staat bij 11% van de voorstellen (was 46%), en het weekend-aandeel is 39% (was 47%). De eerdere afspraak blijft: een dag met een dip die ook echt onverwacht is telt extra mee.</w:t>
+      </w:r>
+    </w:p>
+    <w:p>
+      <w:pPr>
+        <w:pStyle w:val="Heading2"/>
+        <w:spacing w:after="100" w:before="220"/>
+      </w:pPr>
+      <w:r>
+        <w:t xml:space="preserve">Waarom in de speeltuin alles in het weekend viel</w:t>
+      </w:r>
+    </w:p>
+    <w:p>
+      <w:pPr>
+        <w:spacing w:after="120" w:line="300"/>
+      </w:pPr>
+      <w:r>
+        <w:t xml:space="preserve">Dat klopte met de eerste versie en had twee oorzaken. Het gat met de piek was doordeweeks juist groter (72 tot 77 punten) dan in het weekend (65 tot 69). Het weekend won door de bonus voor "ongewoon rustig" (zie hierboven) en door de hogere haalbaarheid. Na de verbetering liggen de scores dicht bij elkaar (zondag 0,78, zaterdag 0,76, dinsdag 0,74, maandag 0,71). Dit is bijna een gelijkspel, en het weekend wint nog steeds nipt. Zonder cool-down (nog niet aangesloten) kiest het model dan elke week dezelfde twee dagen. De cool-down laat de volgende week een andere dag winnen, en die controleren we als volgende stap.</w:t>
+      </w:r>
+    </w:p>
+    <w:p>
+      <w:pPr>
+        <w:pStyle w:val="Heading2"/>
+        <w:spacing w:after="100" w:before="220"/>
+      </w:pPr>
+      <w:r>
+        <w:t xml:space="preserve">Dagoverzicht: doorlopend bewaard</w:t>
+      </w:r>
+    </w:p>
+    <w:p>
+      <w:pPr>
+        <w:spacing w:after="120" w:line="300"/>
+      </w:pPr>
+      <w:r>
+        <w:t xml:space="preserve">Er is een dagoverzicht gebouwd (migratie 0079, twee nieuwe tabellen). Per zaak, per datum en per uur bewaren we de gemeten drukte (mediaan van de uurmetingen) naast wat het Google-patroon toen zei. Daarnaast bewaren we per datum het weer, een eventuele feestdag en de evenementen in de buurt.</w:t>
+      </w:r>
+    </w:p>
+    <w:p>
+      <w:pPr>
+        <w:pStyle w:val="ListParagraph"/>
+        <w:numPr>
+          <w:ilvl w:val="0"/>
+          <w:numId w:val="2"/>
+        </w:numPr>
+        <w:spacing w:after="80" w:line="290"/>
+      </w:pPr>
+      <w:r>
+        <w:rPr>
+          <w:b/>
+          <w:bCs/>
+        </w:rPr>
+        <w:t xml:space="preserve">Doorlopend: </w:t>
+      </w:r>
+      <w:r>
+        <w:t xml:space="preserve">de rollup draait elke nacht (03:30 UTC) en opnieuw vóór de wekelijkse opruiming. Elke run neemt de laatste 120 dagen mee en is idempotent, dus een overgeslagen run herstelt zichzelf.</w:t>
+      </w:r>
+    </w:p>
+    <w:p>
+      <w:pPr>
+        <w:pStyle w:val="ListParagraph"/>
+        <w:numPr>
+          <w:ilvl w:val="0"/>
+          <w:numId w:val="2"/>
+        </w:numPr>
+        <w:spacing w:after="80" w:line="290"/>
+      </w:pPr>
+      <w:r>
+        <w:rPr>
+          <w:b/>
+          <w:bCs/>
+        </w:rPr>
+        <w:t xml:space="preserve">Niets gaat verloren: </w:t>
+      </w:r>
+      <w:r>
+        <w:t xml:space="preserve">de ruwe metingen worden pas opgeruimd als zowel het maandoverzicht als het dagoverzicht voor alle zaken gelukt is. Mislukt er iets, dan blijft de ruwe data staan.</w:t>
+      </w:r>
+    </w:p>
+    <w:p>
+      <w:pPr>
+        <w:pStyle w:val="ListParagraph"/>
+        <w:numPr>
+          <w:ilvl w:val="0"/>
+          <w:numId w:val="2"/>
+        </w:numPr>
+        <w:spacing w:after="80" w:line="290"/>
+      </w:pPr>
+      <w:r>
+        <w:rPr>
+          <w:b/>
+          <w:bCs/>
+        </w:rPr>
+        <w:t xml:space="preserve">Bestaande data: </w:t>
+      </w:r>
+      <w:r>
+        <w:t xml:space="preserve">de eerste run vult automatisch de laatste 120 dagen aan uit de ruwe metingen die nog bestaan. Het weer wordt teruggehaald tot 92 dagen terug.</w:t>
+      </w:r>
+    </w:p>
+    <w:p>
+      <w:pPr>
+        <w:pStyle w:val="ListParagraph"/>
+        <w:numPr>
+          <w:ilvl w:val="0"/>
+          <w:numId w:val="2"/>
+        </w:numPr>
+        <w:spacing w:after="80" w:line="290"/>
+      </w:pPr>
+      <w:r>
+        <w:rPr>
+          <w:b/>
+          <w:bCs/>
+        </w:rPr>
+        <w:t xml:space="preserve">Klein: </w:t>
+      </w:r>
+      <w:r>
+        <w:t xml:space="preserve">ongeveer 9.000 rijen per zaak per jaar. Er is bewust geen opruimregel op deze tabellen.</w:t>
+      </w:r>
+    </w:p>
+    <w:p>
+      <w:pPr>
+        <w:pStyle w:val="ListParagraph"/>
+        <w:numPr>
+          <w:ilvl w:val="0"/>
+          <w:numId w:val="2"/>
+        </w:numPr>
+        <w:spacing w:after="80" w:line="290"/>
+      </w:pPr>
+      <w:r>
+        <w:rPr>
+          <w:b/>
+          <w:bCs/>
+        </w:rPr>
+        <w:t xml:space="preserve">Volgorde bij invoeren: </w:t>
+      </w:r>
+      <w:r>
+        <w:t xml:space="preserve">eerst de SQL draaien (nieuwe tabellen), daarna de code live zetten.</w:t>
       </w:r>
     </w:p>
     <w:sectPr>

</xml_diff>

<commit_message>
docs: model v2 aangesloten (hoofdstuk 12)
</commit_message>
<xml_diff>
--- a/docs/werking/rustige-momenten-model-v2.docx
+++ b/docs/werking/rustige-momenten-model-v2.docx
@@ -6941,6 +6941,158 @@
       </w:r>
       <w:r>
         <w:t xml:space="preserve">eerst de SQL draaien (nieuwe tabellen), daarna de code live zetten.</w:t>
+      </w:r>
+    </w:p>
+    <w:p>
+      <w:pPr>
+        <w:pStyle w:val="Heading1"/>
+        <w:spacing w:after="140" w:before="320"/>
+      </w:pPr>
+      <w:r>
+        <w:t xml:space="preserve">12. Aangesloten op de app</w:t>
+      </w:r>
+    </w:p>
+    <w:p>
+      <w:pPr>
+        <w:spacing w:after="120" w:line="300"/>
+      </w:pPr>
+      <w:r>
+        <w:t xml:space="preserve">Het v2-model (quiet-model.ts) vervangt de rekenkern van de rustige-momenten-detectie. De service (getQuietMoments) haalt alleen nog op wat het model nodig heeft en vertaalt de uitkomst naar hetzelfde formaat als voorheen, dus dashboard, chat en de geleide flow blijven werken.</w:t>
+      </w:r>
+    </w:p>
+    <w:p>
+      <w:pPr>
+        <w:pStyle w:val="ListParagraph"/>
+        <w:numPr>
+          <w:ilvl w:val="0"/>
+          <w:numId w:val="2"/>
+        </w:numPr>
+        <w:spacing w:after="80" w:line="290"/>
+      </w:pPr>
+      <w:r>
+        <w:rPr>
+          <w:b/>
+          <w:bCs/>
+        </w:rPr>
+        <w:t xml:space="preserve">Vier dagdelen </w:t>
+      </w:r>
+      <w:r>
+        <w:t xml:space="preserve">overal: ochtend, lunch, middag, diner (diner loopt tot sluiting). Oude opgeslagen voorstellen met het dagdeel "avond" tellen als diner mee voor de cool-down en de terugkoppeling.</w:t>
+      </w:r>
+    </w:p>
+    <w:p>
+      <w:pPr>
+        <w:pStyle w:val="ListParagraph"/>
+        <w:numPr>
+          <w:ilvl w:val="0"/>
+          <w:numId w:val="2"/>
+        </w:numPr>
+        <w:spacing w:after="80" w:line="290"/>
+      </w:pPr>
+      <w:r>
+        <w:rPr>
+          <w:b/>
+          <w:bCs/>
+        </w:rPr>
+        <w:t xml:space="preserve">Mijn momenten (migratie 0080): </w:t>
+      </w:r>
+      <w:r>
+        <w:t xml:space="preserve">in de instellingen zet de eigenaar momenten (weekdag en dagdeel) aan of uit. Een uitgezet moment krijgt nooit een voorstel. Een dag die de eigenaar zelf kiest in de geleide flow wordt nooit weggefilterd.</w:t>
+      </w:r>
+    </w:p>
+    <w:p>
+      <w:pPr>
+        <w:pStyle w:val="ListParagraph"/>
+        <w:numPr>
+          <w:ilvl w:val="0"/>
+          <w:numId w:val="2"/>
+        </w:numPr>
+        <w:spacing w:after="80" w:line="290"/>
+      </w:pPr>
+      <w:r>
+        <w:rPr>
+          <w:b/>
+          <w:bCs/>
+        </w:rPr>
+        <w:t xml:space="preserve">Tijdvenster </w:t>
+      </w:r>
+      <w:r>
+        <w:t xml:space="preserve">blijft bestaan naast Mijn momenten: het raster kiest weekdag en dagdeel, het venster bakent de uren erbinnen af.</w:t>
+      </w:r>
+    </w:p>
+    <w:p>
+      <w:pPr>
+        <w:pStyle w:val="ListParagraph"/>
+        <w:numPr>
+          <w:ilvl w:val="0"/>
+          <w:numId w:val="2"/>
+        </w:numPr>
+        <w:spacing w:after="80" w:line="290"/>
+      </w:pPr>
+      <w:r>
+        <w:rPr>
+          <w:b/>
+          <w:bCs/>
+        </w:rPr>
+        <w:t xml:space="preserve">Nieuwe schakelaar </w:t>
+      </w:r>
+      <w:r>
+        <w:t xml:space="preserve">voor het tijdvenster, en een centrale regel die vinkjes in het dashboard hun normale grootte geeft (ze stonden midden in de rij).</w:t>
+      </w:r>
+    </w:p>
+    <w:p>
+      <w:pPr>
+        <w:pStyle w:val="ListParagraph"/>
+        <w:numPr>
+          <w:ilvl w:val="0"/>
+          <w:numId w:val="2"/>
+        </w:numPr>
+        <w:spacing w:after="80" w:line="290"/>
+      </w:pPr>
+      <w:r>
+        <w:rPr>
+          <w:b/>
+          <w:bCs/>
+        </w:rPr>
+        <w:t xml:space="preserve">Tests: </w:t>
+      </w:r>
+      <w:r>
+        <w:t xml:space="preserve">536 tests, waaronder de 300 scenario's als blijvende controle op de regels van het model.</w:t>
+      </w:r>
+    </w:p>
+    <w:p>
+      <w:pPr>
+        <w:pStyle w:val="Heading2"/>
+        <w:spacing w:after="100" w:before="220"/>
+      </w:pPr>
+      <w:r>
+        <w:t xml:space="preserve">Nog te doen</w:t>
+      </w:r>
+    </w:p>
+    <w:p>
+      <w:pPr>
+        <w:pStyle w:val="ListParagraph"/>
+        <w:numPr>
+          <w:ilvl w:val="0"/>
+          <w:numId w:val="2"/>
+        </w:numPr>
+        <w:spacing w:after="80" w:line="290"/>
+      </w:pPr>
+      <w:r>
+        <w:t xml:space="preserve">Meten op het tijdvenster in plaats van op het hele dagdeel: de terugkoppeling middelt nu nog over een heel dagdeel (diner is 7 uur), waardoor een effect van een 2-uursvenster verwatert.</w:t>
+      </w:r>
+    </w:p>
+    <w:p>
+      <w:pPr>
+        <w:pStyle w:val="ListParagraph"/>
+        <w:numPr>
+          <w:ilvl w:val="0"/>
+          <w:numId w:val="2"/>
+        </w:numPr>
+        <w:spacing w:after="80" w:line="290"/>
+      </w:pPr>
+      <w:r>
+        <w:t xml:space="preserve">Groepen B tot D van de parameters nalopen, en de flow-controle (Deel 2) en het ontwerp voor "welk type uiting scoort" (Deel 3).</w:t>
       </w:r>
     </w:p>
     <w:sectPr>

</xml_diff>

<commit_message>
groep D: plaatsmoment relatief aan het venster, mail eruit voor nieuwe voorstellen, frequentie per kanaal (Facebook 4) + eindpunt voor de zachte waarschuwing, thema-mix, dode config weg; doel-dagdeel in de geleide flow
Co-Authored-By: Claude Sonnet 5.5 <noreply@anthropic.com>
</commit_message>
<xml_diff>
--- a/docs/werking/rustige-momenten-model-v2.docx
+++ b/docs/werking/rustige-momenten-model-v2.docx
@@ -7093,6 +7093,211 @@
       </w:pPr>
       <w:r>
         <w:t xml:space="preserve">Groepen B tot D van de parameters nalopen, en de flow-controle (Deel 2) en het ontwerp voor "welk type uiting scoort" (Deel 3).</w:t>
+      </w:r>
+    </w:p>
+    <w:p>
+      <w:pPr>
+        <w:pStyle w:val="Heading1"/>
+        <w:spacing w:after="140" w:before="320"/>
+      </w:pPr>
+      <w:r>
+        <w:t xml:space="preserve">13. Groepen B tot D en wat er nog is aangepast</w:t>
+      </w:r>
+    </w:p>
+    <w:p>
+      <w:pPr>
+        <w:pStyle w:val="Heading2"/>
+        <w:spacing w:after="100" w:before="220"/>
+      </w:pPr>
+      <w:r>
+        <w:t xml:space="preserve">Datum-signalen (groep B)</w:t>
+      </w:r>
+    </w:p>
+    <w:p>
+      <w:pPr>
+        <w:pStyle w:val="ListParagraph"/>
+        <w:numPr>
+          <w:ilvl w:val="0"/>
+          <w:numId w:val="2"/>
+        </w:numPr>
+        <w:spacing w:after="80" w:line="290"/>
+      </w:pPr>
+      <w:r>
+        <w:t xml:space="preserve">Feestdagen zijn een moment om op in te spelen (bonus in de score) en per stuk aan of uit te zetten in de instellingen (migratie 0082). Alle feestdagen staan standaard aan. Op rustige dagen kiest Filly een passende, rustige toon.</w:t>
+      </w:r>
+    </w:p>
+    <w:p>
+      <w:pPr>
+        <w:pStyle w:val="ListParagraph"/>
+        <w:numPr>
+          <w:ilvl w:val="0"/>
+          <w:numId w:val="2"/>
+        </w:numPr>
+        <w:spacing w:after="80" w:line="290"/>
+      </w:pPr>
+      <w:r>
+        <w:t xml:space="preserve">Het weer geldt per uur over het voorgestelde tijdvenster, niet meer voor de hele dag.</w:t>
+      </w:r>
+    </w:p>
+    <w:p>
+      <w:pPr>
+        <w:pStyle w:val="ListParagraph"/>
+        <w:numPr>
+          <w:ilvl w:val="0"/>
+          <w:numId w:val="2"/>
+        </w:numPr>
+        <w:spacing w:after="80" w:line="290"/>
+      </w:pPr>
+      <w:r>
+        <w:t xml:space="preserve">Open-Meteo is gratis voor niet-commercieel gebruik. We nemen nu vier vaste weer-opnames per dag (ochtend, lunch, middag, diner) per locatie (migratie 0081) in plaats van live aanroepen. Voor een betaald product is een abonnement nodig; dat staat op de BACKLOG.</w:t>
+      </w:r>
+    </w:p>
+    <w:p>
+      <w:pPr>
+        <w:pStyle w:val="ListParagraph"/>
+        <w:numPr>
+          <w:ilvl w:val="0"/>
+          <w:numId w:val="2"/>
+        </w:numPr>
+        <w:spacing w:after="80" w:line="290"/>
+      </w:pPr>
+      <w:r>
+        <w:t xml:space="preserve">De weer- en evenementgetallen staan met uitleg in quiet-params.ts. Een alleen-lezen SQL (docs/werking/calibratie-weer-evenementen.sql) toetst ze over ongeveer 60 dagen tegen onze eigen metingen.</w:t>
+      </w:r>
+    </w:p>
+    <w:p>
+      <w:pPr>
+        <w:pStyle w:val="Heading2"/>
+        <w:spacing w:after="100" w:before="220"/>
+      </w:pPr>
+      <w:r>
+        <w:t xml:space="preserve">Beleidslaag en terugkoppeling (groep C)</w:t>
+      </w:r>
+    </w:p>
+    <w:p>
+      <w:pPr>
+        <w:pStyle w:val="ListParagraph"/>
+        <w:numPr>
+          <w:ilvl w:val="0"/>
+          <w:numId w:val="2"/>
+        </w:numPr>
+        <w:spacing w:after="80" w:line="290"/>
+      </w:pPr>
+      <w:r>
+        <w:t xml:space="preserve">Het tempo telt de hele week mee (maandag tot zondag), ook wat al geplaatst is.</w:t>
+      </w:r>
+    </w:p>
+    <w:p>
+      <w:pPr>
+        <w:pStyle w:val="ListParagraph"/>
+        <w:numPr>
+          <w:ilvl w:val="0"/>
+          <w:numId w:val="2"/>
+        </w:numPr>
+        <w:spacing w:after="80" w:line="290"/>
+      </w:pPr>
+      <w:r>
+        <w:t xml:space="preserve">De terugkoppeling meet het voorgestelde tijdvenster in plaats van het hele dagdeel.</w:t>
+      </w:r>
+    </w:p>
+    <w:p>
+      <w:pPr>
+        <w:pStyle w:val="ListParagraph"/>
+        <w:numPr>
+          <w:ilvl w:val="0"/>
+          <w:numId w:val="2"/>
+        </w:numPr>
+        <w:spacing w:after="80" w:line="290"/>
+      </w:pPr>
+      <w:r>
+        <w:t xml:space="preserve">Leren in lagen: heeft een moment te weinig eigen metingen (minder dan 3), dan telt wat het dagdeel als geheel liet zien.</w:t>
+      </w:r>
+    </w:p>
+    <w:p>
+      <w:pPr>
+        <w:pStyle w:val="ListParagraph"/>
+        <w:numPr>
+          <w:ilvl w:val="0"/>
+          <w:numId w:val="2"/>
+        </w:numPr>
+        <w:spacing w:after="80" w:line="290"/>
+      </w:pPr>
+      <w:r>
+        <w:t xml:space="preserve">Voorstellen uit de geleide flow bewaren nu ook het doelmoment, zodat de cool-down en de meting ze zien (dat gebeurde eerder alleen bij de automatische voorstellen).</w:t>
+      </w:r>
+    </w:p>
+    <w:p>
+      <w:pPr>
+        <w:pStyle w:val="Heading2"/>
+        <w:spacing w:after="100" w:before="220"/>
+      </w:pPr>
+      <w:r>
+        <w:t xml:space="preserve">Voorstel-inhoud (groep D)</w:t>
+      </w:r>
+    </w:p>
+    <w:p>
+      <w:pPr>
+        <w:pStyle w:val="ListParagraph"/>
+        <w:numPr>
+          <w:ilvl w:val="0"/>
+          <w:numId w:val="2"/>
+        </w:numPr>
+        <w:spacing w:after="80" w:line="290"/>
+      </w:pPr>
+      <w:r>
+        <w:t xml:space="preserve">Het plaatsmoment volgt het voorgestelde venster: vanaf het begin van het venster terug, met de vroegste inplanning en optimale voorsprong per kanaal, aan het begin van een beste venster. Voorbeeld: een middagmoment van 15 uur op dinsdag krijgt een Instagram-post op maandag 12 uur. Te laat voor een kanaal: dat kanaal valt af. Weinig tijd: zo snel mogelijk, met urgentie in de tekst.</w:t>
+      </w:r>
+    </w:p>
+    <w:p>
+      <w:pPr>
+        <w:pStyle w:val="ListParagraph"/>
+        <w:numPr>
+          <w:ilvl w:val="0"/>
+          <w:numId w:val="2"/>
+        </w:numPr>
+        <w:spacing w:after="80" w:line="290"/>
+      </w:pPr>
+      <w:r>
+        <w:t xml:space="preserve">Mail is geen kanaal meer voor nieuwe voorstellen (bestaande mail-campagnes blijven werken). Kanalen: Instagram, Facebook, TikTok en Google.</w:t>
+      </w:r>
+    </w:p>
+    <w:p>
+      <w:pPr>
+        <w:pStyle w:val="ListParagraph"/>
+        <w:numPr>
+          <w:ilvl w:val="0"/>
+          <w:numId w:val="2"/>
+        </w:numPr>
+        <w:spacing w:after="80" w:line="290"/>
+      </w:pPr>
+      <w:r>
+        <w:t xml:space="preserve">Frequentie per kanaal (maximaal per week): Instagram 5, Facebook 4, TikTok 5, Google 3. Bronnen 2026: Instagram 3 tot 5, Facebook 3 tot 4, TikTok 3 tot 7, Google 1 tot 3. Een nieuw eindpunt geeft per kanaal het aantal uitingen in de week en of het maximum bereikt is (voor de zachte waarschuwing).</w:t>
+      </w:r>
+    </w:p>
+    <w:p>
+      <w:pPr>
+        <w:pStyle w:val="ListParagraph"/>
+        <w:numPr>
+          <w:ilvl w:val="0"/>
+          <w:numId w:val="2"/>
+        </w:numPr>
+        <w:spacing w:after="80" w:line="290"/>
+      </w:pPr>
+      <w:r>
+        <w:t xml:space="preserve">Standaardmix per thema (voor "kies jij maar") is bijgewerkt naar de vier kanalen en gaat mee in de prompt.</w:t>
+      </w:r>
+    </w:p>
+    <w:p>
+      <w:pPr>
+        <w:pStyle w:val="ListParagraph"/>
+        <w:numPr>
+          <w:ilvl w:val="0"/>
+          <w:numId w:val="2"/>
+        </w:numPr>
+        <w:spacing w:after="80" w:line="290"/>
+      </w:pPr>
+      <w:r>
+        <w:t xml:space="preserve">Opgeruimd omdat het nergens werd gebruikt: DEFAULT_RATE_LIMITS, de TypeScript-scorelabels en de nachtelijke classificatie in de service (de SQL-functie is de waarheid), RETENTION_ACQUISITION_BALANCE, FUNNEL_STAGE_TO_CHANNELS, suggestChannelMix, CHANNEL_RULES_VERSION.</w:t>
       </w:r>
     </w:p>
     <w:sectPr>

</xml_diff>